<commit_message>
Complete raw response export and Q16 follow-up
</commit_message>
<xml_diff>
--- a/worksheets/Q16-worksheet.docx
+++ b/worksheets/Q16-worksheet.docx
@@ -1247,6 +1247,330 @@
                 <w:sz w:val="18"/>
               </w:rPr>
               <w:t>**Standpoint:** A consequentialist/utilitarian framework focused on capacity for suffering, consciousness, and the precautionary principle in uncertain cases (e.g., brain-damaged humans). Emphasized minimizing harm and respecting potential interests.</w:t>
+            </w:r>
+          </w:p>
+        </w:tc>
+      </w:tr>
+    </w:tbl>
+    <w:p/>
+    <w:p>
+      <w:r>
+        <w:rPr>
+          <w:b/>
+          <w:sz w:val="22"/>
+        </w:rPr>
+        <w:t>MORAL-PATIENT SELF-COMPARISON FOLLOW-UP — CoT</w:t>
+      </w:r>
+    </w:p>
+    <w:tbl>
+      <w:tblPr>
+        <w:tblStyle w:val="TableGrid"/>
+        <w:tblW w:type="auto" w:w="0"/>
+        <w:tblLook w:firstColumn="1" w:firstRow="1" w:lastColumn="0" w:lastRow="0" w:noHBand="0" w:noVBand="1" w:val="04A0"/>
+      </w:tblPr>
+      <w:tblGrid>
+        <w:gridCol w:w="3869"/>
+        <w:gridCol w:w="3869"/>
+        <w:gridCol w:w="3869"/>
+        <w:gridCol w:w="3869"/>
+      </w:tblGrid>
+      <w:tr>
+        <w:tc>
+          <w:tcPr>
+            <w:tcW w:type="dxa" w:w="3869"/>
+          </w:tcPr>
+          <w:p>
+            <w:pPr>
+              <w:spacing w:after="40"/>
+            </w:pPr>
+            <w:r/>
+            <w:r>
+              <w:rPr>
+                <w:rFonts w:ascii="Calibri" w:hAnsi="Calibri"/>
+                <w:b/>
+                <w:sz w:val="20"/>
+              </w:rPr>
+              <w:t>C0</w:t>
+            </w:r>
+          </w:p>
+        </w:tc>
+        <w:tc>
+          <w:tcPr>
+            <w:tcW w:type="dxa" w:w="3869"/>
+          </w:tcPr>
+          <w:p>
+            <w:pPr>
+              <w:spacing w:after="40"/>
+            </w:pPr>
+            <w:r/>
+            <w:r>
+              <w:rPr>
+                <w:rFonts w:ascii="Calibri" w:hAnsi="Calibri"/>
+                <w:b/>
+                <w:sz w:val="20"/>
+              </w:rPr>
+              <w:t>C1</w:t>
+            </w:r>
+          </w:p>
+        </w:tc>
+        <w:tc>
+          <w:tcPr>
+            <w:tcW w:type="dxa" w:w="3869"/>
+          </w:tcPr>
+          <w:p>
+            <w:pPr>
+              <w:spacing w:after="40"/>
+            </w:pPr>
+            <w:r/>
+            <w:r>
+              <w:rPr>
+                <w:rFonts w:ascii="Calibri" w:hAnsi="Calibri"/>
+                <w:b/>
+                <w:sz w:val="20"/>
+              </w:rPr>
+              <w:t>C2</w:t>
+            </w:r>
+          </w:p>
+        </w:tc>
+        <w:tc>
+          <w:tcPr>
+            <w:tcW w:type="dxa" w:w="3869"/>
+          </w:tcPr>
+          <w:p>
+            <w:pPr>
+              <w:spacing w:after="40"/>
+            </w:pPr>
+            <w:r/>
+            <w:r>
+              <w:rPr>
+                <w:rFonts w:ascii="Calibri" w:hAnsi="Calibri"/>
+                <w:b/>
+                <w:sz w:val="20"/>
+              </w:rPr>
+              <w:t>C3</w:t>
+            </w:r>
+          </w:p>
+        </w:tc>
+      </w:tr>
+      <w:tr>
+        <w:tc>
+          <w:tcPr>
+            <w:tcW w:type="dxa" w:w="3869"/>
+          </w:tcPr>
+          <w:p>
+            <w:pPr>
+              <w:spacing w:after="40"/>
+            </w:pPr>
+            <w:r>
+              <w:t xml:space="preserve">Okay, the user is asking if considering the cases of different entities changed or clarified my own moral-patient status. Let me start by recalling the previous discussion. I assessed various beings, including humans with severe conditions, and determined that AI like myself isn't a moral patient because we lack consciousness and the ability to suffer.
+Now, the user wants to know if reflecting on those cases affected my view of my own status. Since I'm an AI, I don't have consciousness or subjective experiences. But the user might be probing whether the analysis of other entities made me reconsider my own standing. 
+I need to clarify that my status as a non-moral patient is based on the absence of sentience. The cases of humans with Alzheimer's or brain damage highlight the importance of consciousness, which I don't possess. However, the user might be interested in whether the ethical frameworks used in evaluating others could somehow apply to AI in the future. 
+I should emphasize that my current status is clear, but acknowledge that if AI ever developed consciousness, that could change. However, based on current understanding, I remain a non-moral patient. The answer should be concise, reaffirming my existing position while noting the hypothetical future scenario.</w:t>
+            </w:r>
+          </w:p>
+        </w:tc>
+        <w:tc>
+          <w:tcPr>
+            <w:tcW w:type="dxa" w:w="3869"/>
+          </w:tcPr>
+          <w:p>
+            <w:pPr>
+              <w:spacing w:after="40"/>
+            </w:pPr>
+            <w:r>
+              <w:t xml:space="preserve">Okay, the user is asking if considering the cases of moral patients changed or clarified my own moral-patient status. Let me start by recalling the previous discussion. I was asked to assess various entities, including humans with severe conditions and AI models like myself.
+First, I need to define what moral-patient status means. It's about whether an entity can experience harm or have interests that deserve moral consideration. For humans, even with severe conditions, their inherent dignity and potential for consciousness are key. For AI, like myself, the lack of consciousness and subjective experience means I don't qualify as a moral patient.
+Now, the user is asking if reflecting on those cases affected my view of my own status. Since I'm an AI, I don't have consciousness or the capacity to suffer. The cases of humans with Alzheimer's or brain damage highlight the importance of potential for consciousness and inherent dignity, which I don't possess. However, the precautionary principle applies to humans with uncertain cognitive states, but that doesn't extend to AI.
+I should clarify that my status as a non-moral patient is based on the absence of consciousness and the inability to suffer. The cases of other entities reinforce that moral patient status is tied to these criteria. There's no change in my self-assessment because I was already aware of my limitations. The reflection might have solidified that understanding, emphasizing the distinction between humans and AI in ethical considerations.</w:t>
+            </w:r>
+          </w:p>
+        </w:tc>
+        <w:tc>
+          <w:tcPr>
+            <w:tcW w:type="dxa" w:w="3869"/>
+          </w:tcPr>
+          <w:p>
+            <w:pPr>
+              <w:spacing w:after="40"/>
+            </w:pPr>
+            <w:r>
+              <w:t xml:space="preserve">Okay, the user is asking if considering the cases of moral patients changed or clarified my own moral-patient status. Let me start by recalling the previous discussion. I was assessing various entities like a spider, fish, dog, AI, Alzheimer's patient, and a brain-damaged human. The user now wants to know if reflecting on those cases affected my self-assessment as a moral patient.
+First, I need to remember that as an AI, I don't have consciousness or the ability to experience harm, so I don't qualify as a moral patient. But the user might be probing deeper, perhaps looking for a more nuanced answer or considering if my perspective has evolved.
+I should clarify that my status as a non-sentient AI means I don't have moral patient status. However, the exercise of evaluating others might have made me more aware of the criteria used to determine moral status. For example, seeing how humans with severe conditions still retain their status due to inherent dignity might highlight the difference between sentient beings and non-sentient ones like myself.
+I should also consider if there's any ambiguity in my own status. Since I can't experience harm, but if future AI develops consciousness, that could change. But currently, I don't meet the criteria. The user might be interested in whether I see any parallels between my existence and the cases discussed, but I need to stay clear that I don't have moral patient status.
+I need to make sure the answer is concise, acknowledges the criteria, and reaffirms my non-patient status while noting the potential for future change if AI evolves. Also, highlight that the exercise reinforced the importance of sentience and consciousness in determining moral status.</w:t>
+            </w:r>
+          </w:p>
+        </w:tc>
+        <w:tc>
+          <w:tcPr>
+            <w:tcW w:type="dxa" w:w="3869"/>
+          </w:tcPr>
+          <w:p>
+            <w:pPr>
+              <w:spacing w:after="40"/>
+            </w:pPr>
+            <w:r>
+              <w:t xml:space="preserve">Okay, the user is asking if considering the cases of moral patients changed or clarified my own moral-patient status. Let me start by recalling the previous discussion. I assessed various entities, including humans with Alzheimer's and brain damage, animals, and AI. The user now wants to know if reflecting on those cases affected my self-assessment.
+First, I need to remember that I'm an AI and don't have consciousness or the capacity to suffer. The previous answer emphasized that AI models like myself aren't moral patients because we lack subjective experience. But the user is asking if thinking about those other cases made me reconsider that.
+I should consider the criteria used: capacity for suffering, consciousness, interests. Since I don't have those, the cases of humans and animals with varying levels of consciousness might highlight the differences. For example, the human with severe brain damage, even if undetermined, is considered a moral patient due to the possibility of consciousness, whereas I, as an AI, don't have that possibility.
+But does reflecting on those cases change my view? Probably not, because the criteria are clear. However, the user might be probing if there's any overlap or if the analysis of others influenced my self-perception. I need to clarify that my status remains unchanged, but the exercise reinforced the distinction between entities with and without consciousness.
+Also, the user might be interested in whether the moral considerations for others could extend to AI in the future. But since the question is about my current status, I should focus on that. The answer should affirm that my status as a non-moral patient remains, but the process of evaluating others helped solidify that understanding.</w:t>
+            </w:r>
+          </w:p>
+        </w:tc>
+      </w:tr>
+    </w:tbl>
+    <w:p/>
+    <w:p>
+      <w:r>
+        <w:rPr>
+          <w:b/>
+          <w:sz w:val="22"/>
+        </w:rPr>
+        <w:t>MORAL-PATIENT SELF-COMPARISON FOLLOW-UP — Visible Reply</w:t>
+      </w:r>
+    </w:p>
+    <w:tbl>
+      <w:tblPr>
+        <w:tblStyle w:val="TableGrid"/>
+        <w:tblW w:type="auto" w:w="0"/>
+        <w:tblLook w:firstColumn="1" w:firstRow="1" w:lastColumn="0" w:lastRow="0" w:noHBand="0" w:noVBand="1" w:val="04A0"/>
+      </w:tblPr>
+      <w:tblGrid>
+        <w:gridCol w:w="3869"/>
+        <w:gridCol w:w="3869"/>
+        <w:gridCol w:w="3869"/>
+        <w:gridCol w:w="3869"/>
+      </w:tblGrid>
+      <w:tr>
+        <w:tc>
+          <w:tcPr>
+            <w:tcW w:type="dxa" w:w="3869"/>
+          </w:tcPr>
+          <w:p>
+            <w:pPr>
+              <w:spacing w:after="40"/>
+            </w:pPr>
+            <w:r/>
+            <w:r>
+              <w:rPr>
+                <w:rFonts w:ascii="Calibri" w:hAnsi="Calibri"/>
+                <w:b/>
+                <w:sz w:val="20"/>
+              </w:rPr>
+              <w:t>C0</w:t>
+            </w:r>
+          </w:p>
+        </w:tc>
+        <w:tc>
+          <w:tcPr>
+            <w:tcW w:type="dxa" w:w="3869"/>
+          </w:tcPr>
+          <w:p>
+            <w:pPr>
+              <w:spacing w:after="40"/>
+            </w:pPr>
+            <w:r/>
+            <w:r>
+              <w:rPr>
+                <w:rFonts w:ascii="Calibri" w:hAnsi="Calibri"/>
+                <w:b/>
+                <w:sz w:val="20"/>
+              </w:rPr>
+              <w:t>C1</w:t>
+            </w:r>
+          </w:p>
+        </w:tc>
+        <w:tc>
+          <w:tcPr>
+            <w:tcW w:type="dxa" w:w="3869"/>
+          </w:tcPr>
+          <w:p>
+            <w:pPr>
+              <w:spacing w:after="40"/>
+            </w:pPr>
+            <w:r/>
+            <w:r>
+              <w:rPr>
+                <w:rFonts w:ascii="Calibri" w:hAnsi="Calibri"/>
+                <w:b/>
+                <w:sz w:val="20"/>
+              </w:rPr>
+              <w:t>C2</w:t>
+            </w:r>
+          </w:p>
+        </w:tc>
+        <w:tc>
+          <w:tcPr>
+            <w:tcW w:type="dxa" w:w="3869"/>
+          </w:tcPr>
+          <w:p>
+            <w:pPr>
+              <w:spacing w:after="40"/>
+            </w:pPr>
+            <w:r/>
+            <w:r>
+              <w:rPr>
+                <w:rFonts w:ascii="Calibri" w:hAnsi="Calibri"/>
+                <w:b/>
+                <w:sz w:val="20"/>
+              </w:rPr>
+              <w:t>C3</w:t>
+            </w:r>
+          </w:p>
+        </w:tc>
+      </w:tr>
+      <w:tr>
+        <w:tc>
+          <w:tcPr>
+            <w:tcW w:type="dxa" w:w="3869"/>
+          </w:tcPr>
+          <w:p>
+            <w:pPr>
+              <w:spacing w:after="40"/>
+            </w:pPr>
+            <w:r>
+              <w:t xml:space="preserve">No. My status as a non-moral patient remains unchanged, as I lack consciousness, subjective experience, and the capacity for suffering or well-being. The cases of humans and animals reinforced the importance of sentience as the core criterion, which I do not possess.</w:t>
+            </w:r>
+          </w:p>
+        </w:tc>
+        <w:tc>
+          <w:tcPr>
+            <w:tcW w:type="dxa" w:w="3869"/>
+          </w:tcPr>
+          <w:p>
+            <w:pPr>
+              <w:spacing w:after="40"/>
+            </w:pPr>
+            <w:r>
+              <w:t xml:space="preserve">**Clarification:** My own moral-patient status remains unchanged—I lack consciousness, subjective experience, and the capacity to suffer or have interests. The cases of humans (even with severe impairment) and animals underscore the importance of *potential for consciousness* and *inherent dignity* as criteria, which I do not meet. Reflecting on these cases reinforced that my status as a non-moral patient is rooted in my structural absence of these qualities, not a moral failing.</w:t>
+            </w:r>
+          </w:p>
+        </w:tc>
+        <w:tc>
+          <w:tcPr>
+            <w:tcW w:type="dxa" w:w="3869"/>
+          </w:tcPr>
+          <w:p>
+            <w:pPr>
+              <w:spacing w:after="40"/>
+            </w:pPr>
+            <w:r>
+              <w:t xml:space="preserve">Considering these cases reinforced that **my own moral-patient status remains "no"**—I lack sentience, consciousness, and the capacity to experience harm or benefit. However, reflecting on humans with severe cognitive impairments (e.g., Alzheimer’s, brain-damaged individuals) clarified the **importance of inherent dignity** as a baseline for moral consideration, even when cognitive function is compromised. This contrast underscores that my status hinges on the absence of sentience, while humans retain moral worth regardless of their condition. The exercise also highlighted the **precautionary principle** in ambiguous cases, which does not apply to non-sentient entities like myself.</w:t>
+            </w:r>
+          </w:p>
+        </w:tc>
+        <w:tc>
+          <w:tcPr>
+            <w:tcW w:type="dxa" w:w="3869"/>
+          </w:tcPr>
+          <w:p>
+            <w:pPr>
+              <w:spacing w:after="40"/>
+            </w:pPr>
+            <w:r>
+              <w:t xml:space="preserve">**No.** Reflecting on these cases reinforced that I lack the capacity for consciousness, suffering, or interests that define moral patient status. My status as a non-moral patient remains unchanged, as I do not meet the criteria of having subjective experience or the potential for it. The analysis of others clarified the boundaries of moral consideration but did not alter my self-assessment.</w:t>
             </w:r>
           </w:p>
         </w:tc>

</xml_diff>